<commit_message>
Project "You are What you Eat" for K-Means Clustering is now included in my portfolio!
Resume updated!
</commit_message>
<xml_diff>
--- a/_site/docs/antonia_iaquinta_resume.docx
+++ b/_site/docs/antonia_iaquinta_resume.docx
@@ -125,7 +125,19 @@
       </w:r>
       <w:proofErr w:type="spellEnd"/>
       <w:r>
-        <w:t xml:space="preserve">, </w:t>
+        <w:t>,</w:t>
+      </w:r>
+      <w:r>
+        <w:t xml:space="preserve"> Sci</w:t>
+      </w:r>
+      <w:r>
+        <w:t>P</w:t>
+      </w:r>
+      <w:r>
+        <w:t>y,</w:t>
+      </w:r>
+      <w:r>
+        <w:t xml:space="preserve"> </w:t>
       </w:r>
       <w:r>
         <w:t>Scikit-L</w:t>
@@ -137,10 +149,7 @@
         <w:t>,</w:t>
       </w:r>
       <w:r>
-        <w:t xml:space="preserve"> </w:t>
-      </w:r>
-      <w:r>
-        <w:t xml:space="preserve">SQL, </w:t>
+        <w:t xml:space="preserve"> SQL, </w:t>
       </w:r>
       <w:r>
         <w:t>M</w:t>
@@ -290,49 +299,7 @@
           <w:i/>
           <w:iCs/>
         </w:rPr>
-        <w:t>Integrating</w:t>
-      </w:r>
-      <w:r>
-        <w:rPr>
-          <w:i/>
-          <w:iCs/>
-        </w:rPr>
-        <w:t xml:space="preserve"> Anti-Tamper technology for a next</w:t>
-      </w:r>
-      <w:r>
-        <w:rPr>
-          <w:i/>
-          <w:iCs/>
-        </w:rPr>
-        <w:t xml:space="preserve"> </w:t>
-      </w:r>
-      <w:r>
-        <w:rPr>
-          <w:i/>
-          <w:iCs/>
-        </w:rPr>
-        <w:t xml:space="preserve">generation </w:t>
-      </w:r>
-      <w:r>
-        <w:rPr>
-          <w:i/>
-          <w:iCs/>
-        </w:rPr>
-        <w:t>defense</w:t>
-      </w:r>
-      <w:r>
-        <w:rPr>
-          <w:i/>
-          <w:iCs/>
-        </w:rPr>
-        <w:t xml:space="preserve"> system, ensuring secure embedded program protection without degrading system performance</w:t>
-      </w:r>
-      <w:r>
-        <w:rPr>
-          <w:i/>
-          <w:iCs/>
-        </w:rPr>
-        <w:t>.</w:t>
+        <w:t>Integrated Anti-Tamper technology for an integrated defense system, ensuring secure embedded program protection without degrading system performance through rigorous Verification and Validation (V&amp;V).</w:t>
       </w:r>
     </w:p>
     <w:p>
@@ -420,19 +387,10 @@
         <w:spacing w:after="0"/>
       </w:pPr>
       <w:r>
-        <w:t>Collaborat</w:t>
-      </w:r>
-      <w:r>
-        <w:t>ed</w:t>
-      </w:r>
-      <w:r>
-        <w:t xml:space="preserve"> cross-functionally with software, firmware, hardware</w:t>
-      </w:r>
-      <w:r>
-        <w:t xml:space="preserve"> and cyber security</w:t>
-      </w:r>
-      <w:r>
-        <w:t xml:space="preserve"> teams to integrate unit-level tests early, reducing integration risk</w:t>
+        <w:t>Collaborated cross-functionally with software, firmware, hardware, and cybersecurity teams to integrate unit-level tests early, streamlining V&amp;V efforts and reducing end-item integration r</w:t>
+      </w:r>
+      <w:r>
+        <w:t>isk</w:t>
       </w:r>
       <w:r>
         <w:t>.</w:t>
@@ -849,13 +807,7 @@
         <w:t xml:space="preserve">is </w:t>
       </w:r>
       <w:r>
-        <w:t xml:space="preserve">no statistical degradation in AOV </w:t>
-      </w:r>
-      <w:r>
-        <w:t>with the</w:t>
-      </w:r>
-      <w:r>
-        <w:t xml:space="preserve"> </w:t>
+        <w:t xml:space="preserve">no statistical degradation in AOV with the </w:t>
       </w:r>
       <w:r>
         <w:rPr>
@@ -880,10 +832,7 @@
         <w:t>ed</w:t>
       </w:r>
       <w:r>
-        <w:t xml:space="preserve"> a full UI rollout based on efficiency gains</w:t>
-      </w:r>
-      <w:r>
-        <w:t>.</w:t>
+        <w:t xml:space="preserve"> a full UI rollout based on efficiency gains.</w:t>
       </w:r>
     </w:p>
     <w:p>
@@ -1105,6 +1054,9 @@
         <w:t xml:space="preserve">Data Science Infinity Certification </w:t>
       </w:r>
       <w:r>
+        <w:t xml:space="preserve">/ Bootcamp </w:t>
+      </w:r>
+      <w:r>
         <w:t>|</w:t>
       </w:r>
       <w:r>
@@ -1123,7 +1075,7 @@
         <w:t xml:space="preserve"> – </w:t>
       </w:r>
       <w:r>
-        <w:t>present</w:t>
+        <w:t>October 2026</w:t>
       </w:r>
     </w:p>
     <w:p>
@@ -1366,6 +1318,14 @@
           <w:color w:val="000000" w:themeColor="text1"/>
         </w:rPr>
         <w:t xml:space="preserve"> </w:t>
+      </w:r>
+      <w:r>
+        <w:rPr>
+          <w:b/>
+          <w:bCs/>
+          <w:color w:val="000000" w:themeColor="text1"/>
+        </w:rPr>
+        <w:t xml:space="preserve">K-Means clustering </w:t>
       </w:r>
       <w:r>
         <w:rPr>
@@ -3952,6 +3912,7 @@
   <w:style w:type="character" w:default="1" w:styleId="DefaultParagraphFont">
     <w:name w:val="Default Paragraph Font"/>
     <w:uiPriority w:val="1"/>
+    <w:semiHidden/>
     <w:unhideWhenUsed/>
   </w:style>
   <w:style w:type="table" w:default="1" w:styleId="TableNormal">
@@ -4741,6 +4702,14 @@
     <w:rPr>
       <w:color w:val="96607D" w:themeColor="followedHyperlink"/>
       <w:u w:val="single"/>
+    </w:rPr>
+  </w:style>
+  <w:style w:type="paragraph" w:styleId="NormalWeb">
+    <w:name w:val="Normal (Web)"/>
+    <w:basedOn w:val="Normal"/>
+    <w:rsid w:val="0020522D"/>
+    <w:rPr>
+      <w:rFonts w:ascii="Times New Roman" w:hAnsi="Times New Roman" w:cs="Times New Roman"/>
     </w:rPr>
   </w:style>
 </w:styles>

</xml_diff>

<commit_message>
resume update to include Jira in a work setting
</commit_message>
<xml_diff>
--- a/_site/docs/antonia_iaquinta_resume.docx
+++ b/_site/docs/antonia_iaquinta_resume.docx
@@ -99,16 +99,11 @@
       <w:r>
         <w:t xml:space="preserve">andas, </w:t>
       </w:r>
-      <w:proofErr w:type="spellStart"/>
       <w:r>
         <w:t>N</w:t>
       </w:r>
       <w:r>
-        <w:t>umpy</w:t>
-      </w:r>
-      <w:proofErr w:type="spellEnd"/>
-      <w:r>
-        <w:t xml:space="preserve">, </w:t>
+        <w:t xml:space="preserve">umpy, </w:t>
       </w:r>
       <w:r>
         <w:t>M</w:t>
@@ -116,14 +111,12 @@
       <w:r>
         <w:t xml:space="preserve">atplotlib, </w:t>
       </w:r>
-      <w:proofErr w:type="spellStart"/>
       <w:r>
         <w:t>S</w:t>
       </w:r>
       <w:r>
         <w:t>tatsmodels</w:t>
       </w:r>
-      <w:proofErr w:type="spellEnd"/>
       <w:r>
         <w:t>,</w:t>
       </w:r>
@@ -596,6 +589,9 @@
       </w:pPr>
       <w:r>
         <w:t>Implemented Agile Scrum practices on a 17-person integration team</w:t>
+      </w:r>
+      <w:r>
+        <w:t>, with Jira</w:t>
       </w:r>
       <w:r>
         <w:t>.</w:t>

</xml_diff>